<commit_message>
Renseigner la date de signature et le conseiller ANAPEC dans les dossiers
- « Fait à …, le » / « حرر ب … بتاريخ » : DATE_SIGNATURE
- Avenant : agence représentée par le conseiller (Agadir : BRAHIM ALAAOUCH,
  Inezgane Aït Melloul : SAID EN KHAL), repris sous le visa ANAPEC du contrat

Co-Authored-By: Claude Opus 5.5 <noreply@anthropic.com>
Claude-Session: https://claude.ai/code/session_014gb9DYV37U5p7uWnQ7yfmM
</commit_message>
<xml_diff>
--- a/regularisation/AGADIR/AG0308261153505-1 - KIRRI HICHAM/1 - Nouveau contrat AG0308261153505-1.docx
+++ b/regularisation/AGADIR/AG0308261153505-1 - KIRRI HICHAM/1 - Nouveau contrat AG0308261153505-1.docx
@@ -4694,36 +4694,33 @@
           <w:szCs w:val="18"/>
           <w:rtl/>
         </w:rPr>
-        <w:t xml:space="preserve"> .</w:t>
-      </w:r>
-      <w:r>
-        <w:rPr>
-          <w:b/>
-          <w:bCs/>
-          <w:sz w:val="18"/>
-          <w:szCs w:val="18"/>
-          <w:rtl/>
-        </w:rPr>
-        <w:t>..... ....</w:t>
-      </w:r>
-      <w:r>
-        <w:rPr>
-          <w:b/>
-          <w:bCs/>
-          <w:sz w:val="18"/>
-          <w:szCs w:val="18"/>
-        </w:rPr>
-        <w:t>...............................</w:t>
-      </w:r>
-      <w:r>
-        <w:rPr>
-          <w:b/>
-          <w:bCs/>
-          <w:sz w:val="18"/>
-          <w:szCs w:val="18"/>
-          <w:rtl/>
-        </w:rPr>
-        <w:t xml:space="preserve">......... </w:t>
+        <w:t xml:space="preserve"> ‏ 13/08/2026 ‏</w:t>
+      </w:r>
+      <w:r>
+        <w:rPr>
+          <w:b/>
+          <w:bCs/>
+          <w:sz w:val="18"/>
+          <w:szCs w:val="18"/>
+          <w:rtl/>
+        </w:rPr>
+      </w:r>
+      <w:r>
+        <w:rPr>
+          <w:b/>
+          <w:bCs/>
+          <w:sz w:val="18"/>
+          <w:szCs w:val="18"/>
+        </w:rPr>
+      </w:r>
+      <w:r>
+        <w:rPr>
+          <w:b/>
+          <w:bCs/>
+          <w:sz w:val="18"/>
+          <w:szCs w:val="18"/>
+          <w:rtl/>
+        </w:rPr>
       </w:r>
     </w:p>
     <w:tbl>
@@ -4960,6 +4957,9 @@
                 <w:szCs w:val="18"/>
               </w:rPr>
             </w:pPr>
+            <w:r>
+              <w:t>BRAHIM ALAAOUCH</w:t>
+            </w:r>
           </w:p>
         </w:tc>
         <w:tc>

</xml_diff>

<commit_message>
Contrat : 44 h/semaine et 18 jours de congé annuel, comme le modèle ANAPEC
La ligne des cas particuliers de résiliation est laissée sans pointillés,
comme dans le contrat édité par le système.

Co-Authored-By: Claude Opus 5.5 <noreply@anthropic.com>
Claude-Session: https://claude.ai/code/session_014gb9DYV37U5p7uWnQ7yfmM
</commit_message>
<xml_diff>
--- a/regularisation/AGADIR/AG0308261153505-1 - KIRRI HICHAM/1 - Nouveau contrat AG0308261153505-1.docx
+++ b/regularisation/AGADIR/AG0308261153505-1 - KIRRI HICHAM/1 - Nouveau contrat AG0308261153505-1.docx
@@ -2904,7 +2904,7 @@
           <w:szCs w:val="18"/>
           <w:rtl/>
         </w:rPr>
-        <w:t>بها العمل .......................................................................................</w:t>
+        <w:t xml:space="preserve">بها العمل  18 يوم </w:t>
       </w:r>
       <w:r>
         <w:rPr>
@@ -2913,16 +2913,14 @@
           <w:szCs w:val="18"/>
           <w:rtl/>
         </w:rPr>
-        <w:t>.......................</w:t>
-      </w:r>
-      <w:r>
-        <w:rPr>
-          <w:rFonts w:ascii="Cambria" w:eastAsia="Cambria" w:hAnsi="Cambria" w:cs="Cambria"/>
-          <w:sz w:val="18"/>
-          <w:szCs w:val="18"/>
-          <w:rtl/>
-        </w:rPr>
-        <w:t xml:space="preserve"> </w:t>
+      </w:r>
+      <w:r>
+        <w:rPr>
+          <w:rFonts w:ascii="Cambria" w:eastAsia="Cambria" w:hAnsi="Cambria" w:cs="Cambria"/>
+          <w:sz w:val="18"/>
+          <w:szCs w:val="18"/>
+          <w:rtl/>
+        </w:rPr>
       </w:r>
     </w:p>
     <w:p>
@@ -3321,7 +3319,7 @@
           <w:szCs w:val="18"/>
           <w:rtl/>
         </w:rPr>
-        <w:t xml:space="preserve">بالعمل لمدة......................................ساعة في </w:t>
+        <w:t xml:space="preserve">بالعمل لمدة 44 ساعة في </w:t>
       </w:r>
       <w:r>
         <w:rPr>
@@ -3793,16 +3791,14 @@
           <w:szCs w:val="18"/>
           <w:rtl/>
         </w:rPr>
-        <w:t xml:space="preserve">......................................................................................................................................................... .............. </w:t>
-      </w:r>
-      <w:r>
-        <w:rPr>
-          <w:rFonts w:ascii="Cambria" w:eastAsia="Cambria" w:hAnsi="Cambria" w:cs="Cambria"/>
-          <w:sz w:val="18"/>
-          <w:szCs w:val="18"/>
-          <w:rtl/>
-        </w:rPr>
-        <w:t xml:space="preserve"> </w:t>
+      </w:r>
+      <w:r>
+        <w:rPr>
+          <w:rFonts w:ascii="Cambria" w:eastAsia="Cambria" w:hAnsi="Cambria" w:cs="Cambria"/>
+          <w:sz w:val="18"/>
+          <w:szCs w:val="18"/>
+          <w:rtl/>
+        </w:rPr>
       </w:r>
     </w:p>
     <w:p>

</xml_diff>

<commit_message>
Retirer les pointillés des champs sans donnée (ligne laissée vide)
Co-Authored-By: Claude Opus 5.5 <noreply@anthropic.com>
Claude-Session: https://claude.ai/code/session_014gb9DYV37U5p7uWnQ7yfmM
</commit_message>
<xml_diff>
--- a/regularisation/AGADIR/AG0308261153505-1 - KIRRI HICHAM/1 - Nouveau contrat AG0308261153505-1.docx
+++ b/regularisation/AGADIR/AG0308261153505-1 - KIRRI HICHAM/1 - Nouveau contrat AG0308261153505-1.docx
@@ -769,7 +769,7 @@
           <w:szCs w:val="18"/>
           <w:rtl/>
         </w:rPr>
-        <w:t xml:space="preserve">البريد الالكترووني................................................................................................................................................................................................................................................................ . </w:t>
+        <w:t xml:space="preserve">البريد الالكترووني </w:t>
       </w:r>
     </w:p>
     <w:p>
@@ -809,22 +809,20 @@
           <w:szCs w:val="18"/>
           <w:rtl/>
         </w:rPr>
-        <w:t>............</w:t>
-      </w:r>
-      <w:r>
-        <w:rPr>
-          <w:sz w:val="18"/>
-          <w:szCs w:val="18"/>
-        </w:rPr>
-        <w:t>....................................................................................................................................................................</w:t>
-      </w:r>
-      <w:r>
-        <w:rPr>
-          <w:sz w:val="18"/>
-          <w:szCs w:val="18"/>
-          <w:rtl/>
-        </w:rPr>
-        <w:t xml:space="preserve">.............................................................................. . </w:t>
+        <w:t xml:space="preserve"> </w:t>
+      </w:r>
+      <w:r>
+        <w:rPr>
+          <w:sz w:val="18"/>
+          <w:szCs w:val="18"/>
+        </w:rPr>
+      </w:r>
+      <w:r>
+        <w:rPr>
+          <w:sz w:val="18"/>
+          <w:szCs w:val="18"/>
+          <w:rtl/>
+        </w:rPr>
       </w:r>
     </w:p>
     <w:p>
@@ -843,7 +841,7 @@
           <w:szCs w:val="18"/>
           <w:rtl/>
         </w:rPr>
-        <w:t xml:space="preserve"> رقم التعريف الموحد للمقاولة ......................................................................................... .............................................................. .................................................. .................................. . </w:t>
+        <w:t xml:space="preserve"> رقم التعريف الموحد للمقاولة  </w:t>
       </w:r>
     </w:p>
     <w:p>
@@ -884,7 +882,7 @@
           <w:rtl/>
         </w:rPr>
         <w:tab/>
-        <w:t xml:space="preserve"> ................................................................................................................................................................................................................... ..................................... . </w:t>
+        <w:t xml:space="preserve">  </w:t>
       </w:r>
     </w:p>
     <w:p>
@@ -922,7 +920,7 @@
           <w:szCs w:val="18"/>
           <w:rtl/>
         </w:rPr>
-        <w:t xml:space="preserve">النظام القانوني ............................................................................................................................. ..................................................................................................................................... . </w:t>
+        <w:t xml:space="preserve">النظام القانوني  </w:t>
       </w:r>
     </w:p>
     <w:p>
@@ -1498,7 +1496,7 @@
           <w:szCs w:val="18"/>
           <w:rtl/>
         </w:rPr>
-        <w:t xml:space="preserve"> .........................................................................................................                غير حاصل على شهادة </w:t>
+        <w:t xml:space="preserve">  غير حاصل على شهادة </w:t>
       </w:r>
       <w:r>
         <w:rPr>
@@ -2020,7 +2018,7 @@
           <w:szCs w:val="18"/>
           <w:rtl/>
         </w:rPr>
-        <w:t>.</w:t>
+        <w:t xml:space="preserve"> </w:t>
       </w:r>
       <w:r>
         <w:rPr>
@@ -2029,14 +2027,12 @@
           <w:szCs w:val="18"/>
           <w:rtl/>
         </w:rPr>
-        <w:t>.....................................................................................................................................................................................................................</w:t>
-      </w:r>
-      <w:r>
-        <w:rPr>
-          <w:sz w:val="18"/>
-          <w:szCs w:val="18"/>
-        </w:rPr>
-        <w:t>.......</w:t>
+      </w:r>
+      <w:r>
+        <w:rPr>
+          <w:sz w:val="18"/>
+          <w:szCs w:val="18"/>
+        </w:rPr>
       </w:r>
       <w:r>
         <w:rPr>
@@ -2045,16 +2041,14 @@
           <w:szCs w:val="18"/>
           <w:rtl/>
         </w:rPr>
-        <w:t>..................</w:t>
-      </w:r>
-      <w:r>
-        <w:rPr>
-          <w:rFonts w:ascii="Cambria" w:eastAsia="Cambria" w:hAnsi="Cambria" w:cs="Cambria"/>
-          <w:sz w:val="18"/>
-          <w:szCs w:val="18"/>
-          <w:rtl/>
-        </w:rPr>
-        <w:t xml:space="preserve"> </w:t>
+      </w:r>
+      <w:r>
+        <w:rPr>
+          <w:rFonts w:ascii="Cambria" w:eastAsia="Cambria" w:hAnsi="Cambria" w:cs="Cambria"/>
+          <w:sz w:val="18"/>
+          <w:szCs w:val="18"/>
+          <w:rtl/>
+        </w:rPr>
       </w:r>
     </w:p>
     <w:p>
@@ -3791,6 +3785,7 @@
           <w:szCs w:val="18"/>
           <w:rtl/>
         </w:rPr>
+        <w:t xml:space="preserve"> </w:t>
       </w:r>
       <w:r>
         <w:rPr>

</xml_diff>